<commit_message>
Corrige dos errores de contenido en capítulos 7 y 8 (guía de repaso A1)
Comparado contra el solucionario oficial transcrito
(cuaderno-unidad7c_como-es.md y cuaderno-unidad8b_que-hizo-rosa-ayer.md):

- Ej.27 (cap.7, V/F sobre Las meninas): faltaba el ítem "Una menina es
  rubia -> V" del solucionario real (6 de 7 ítems).
- Ej.30 (cap.8): "¿___ (Ser, tú) al final a la fiesta?" etiquetaba mal
  el verbo -- "fuiste a la fiesta" es de ir, no de ser, aunque ambos
  compartan la forma "fuiste". Corregido a "(Ir, tú)".

Aplicado en los tres sitios: docx, interactivo, y el .md archivado en
fuentes/. Reconstruidos y reverificados: pandoc (40 ejercicios, 18
imágenes) y Playwright (256/256, 0 imágenes rotas).
</commit_message>
<xml_diff>
--- a/docencia-espanol/materiales/a1/nuevo-espanol-en-marcha-1_guia-repaso-unidades-1-10.docx
+++ b/docencia-espanol/materiales/a1/nuevo-espanol-en-marcha-1_guia-repaso-unidades-1-10.docx
@@ -9652,6 +9652,22 @@
         <w:t xml:space="preserve">d. </w:t>
       </w:r>
       <w:r>
+        <w:t xml:space="preserve">Una menina es rubia. (V / F)</w:t>
+      </w:r>
+    </w:p>
+    <w:p>
+      <w:pPr>
+        <w:spacing w:after="80"/>
+      </w:pPr>
+      <w:r>
+        <w:rPr>
+          <w:b/>
+          <w:bCs/>
+          <w:color w:val="A8790C"/>
+        </w:rPr>
+        <w:t xml:space="preserve">e. </w:t>
+      </w:r>
+      <w:r>
         <w:t xml:space="preserve">El pintor tiene barba y bigote. (V / F)</w:t>
       </w:r>
     </w:p>
@@ -9665,7 +9681,7 @@
           <w:bCs/>
           <w:color w:val="A8790C"/>
         </w:rPr>
-        <w:t xml:space="preserve">e. </w:t>
+        <w:t xml:space="preserve">f. </w:t>
       </w:r>
       <w:r>
         <w:t xml:space="preserve">El pintor es calvo. (V / F)</w:t>
@@ -9681,7 +9697,7 @@
           <w:bCs/>
           <w:color w:val="A8790C"/>
         </w:rPr>
-        <w:t xml:space="preserve">f. </w:t>
+        <w:t xml:space="preserve">g. </w:t>
       </w:r>
       <w:r>
         <w:t xml:space="preserve">La infanta es alta. (V / F)</w:t>
@@ -10942,7 +10958,7 @@
         <w:t xml:space="preserve">f. </w:t>
       </w:r>
       <w:r>
-        <w:t xml:space="preserve">¿___________ (Ser, tú) al final a la fiesta?</w:t>
+        <w:t xml:space="preserve">¿___________ (Ir, tú) al final a la fiesta?</w:t>
       </w:r>
     </w:p>
     <w:p>
@@ -13626,7 +13642,7 @@
         <w:t xml:space="preserve">Ejercicio 27: </w:t>
       </w:r>
       <w:r>
-        <w:t xml:space="preserve">a. F  b. F  c. F  d. V  e. F  f. F</w:t>
+        <w:t xml:space="preserve">a. F  b. F  c. F  d. V  e. V  f. F  g. F</w:t>
       </w:r>
     </w:p>
     <w:p>

</xml_diff>